<commit_message>
OOP 1 & 2 +++
</commit_message>
<xml_diff>
--- a/Five/OOP/Lab1/Михайлич_Максим_Игоревич_5151003_40802_ООП_Лаб1.docx
+++ b/Five/OOP/Lab1/Михайлич_Максим_Игоревич_5151003_40802_ООП_Лаб1.docx
@@ -5243,6 +5243,846 @@
     </w:p>
     <w:p>
       <w:pPr>
+        <w:spacing w:line="240" w:lineRule="auto"/>
+        <w:ind w:firstLine="0"/>
+        <w:rPr>
+          <w:lang w:val="en-US"/>
+        </w:rPr>
+      </w:pPr>
+      <w:r>
+        <w:rPr>
+          <w:lang w:val="en-US"/>
+        </w:rPr>
+        <w:br w:type="page"/>
+      </w:r>
+    </w:p>
+    <w:p>
+      <w:pPr>
+        <w:pStyle w:val="a9"/>
+      </w:pPr>
+      <w:r>
+        <w:lastRenderedPageBreak/>
+        <w:t>дОПОЛНИТЕЛЬНОЕ ЗАДАНИЕ № 3</w:t>
+      </w:r>
+    </w:p>
+    <w:p>
+      <w:r>
+        <w:t xml:space="preserve">В ходе выполнения дополнительного задания необходимо модифицировать </w:t>
+      </w:r>
+      <w:r>
+        <w:rPr>
+          <w:lang w:val="en-US"/>
+        </w:rPr>
+        <w:t>private</w:t>
+      </w:r>
+      <w:r>
+        <w:t xml:space="preserve"> </w:t>
+      </w:r>
+      <w:r>
+        <w:t>поле экземпляра при помощи отладчика.</w:t>
+      </w:r>
+    </w:p>
+    <w:p>
+      <w:pPr>
+        <w:rPr>
+          <w:lang w:val="en-US"/>
+        </w:rPr>
+      </w:pPr>
+      <w:r>
+        <w:rPr>
+          <w:b/>
+          <w:bCs/>
+        </w:rPr>
+        <w:t xml:space="preserve">Создание </w:t>
+      </w:r>
+      <w:r>
+        <w:rPr>
+          <w:b/>
+          <w:bCs/>
+          <w:lang w:val="en-US"/>
+        </w:rPr>
+        <w:t>DLL</w:t>
+      </w:r>
+      <w:r>
+        <w:rPr>
+          <w:b/>
+          <w:bCs/>
+        </w:rPr>
+        <w:t>:</w:t>
+      </w:r>
+      <w:r>
+        <w:t xml:space="preserve"> </w:t>
+      </w:r>
+      <w:r>
+        <w:t xml:space="preserve">для компиляции проекта в </w:t>
+      </w:r>
+      <w:r>
+        <w:t>.</w:t>
+      </w:r>
+      <w:proofErr w:type="spellStart"/>
+      <w:r>
+        <w:rPr>
+          <w:lang w:val="en-US"/>
+        </w:rPr>
+        <w:t>dll</w:t>
+      </w:r>
+      <w:proofErr w:type="spellEnd"/>
+      <w:r>
+        <w:t xml:space="preserve"> файл необходимо в основном файле добавить макрос </w:t>
+      </w:r>
+      <w:r>
+        <w:rPr>
+          <w:lang w:val="en-US"/>
+        </w:rPr>
+        <w:t>MYSTRING</w:t>
+      </w:r>
+      <w:r>
+        <w:t>_</w:t>
+      </w:r>
+      <w:r>
+        <w:rPr>
+          <w:lang w:val="en-US"/>
+        </w:rPr>
+        <w:t>EXPORTS</w:t>
+      </w:r>
+      <w:r>
+        <w:t xml:space="preserve">, </w:t>
+      </w:r>
+      <w:r>
+        <w:t xml:space="preserve">а в заголовочном файле добавить препроцессор, определяющий наличие данного макроса и, если он есть, то вызывается экспорт функций в </w:t>
+      </w:r>
+      <w:proofErr w:type="spellStart"/>
+      <w:r>
+        <w:rPr>
+          <w:lang w:val="en-US"/>
+        </w:rPr>
+        <w:t>dll</w:t>
+      </w:r>
+      <w:proofErr w:type="spellEnd"/>
+      <w:r>
+        <w:t xml:space="preserve">, </w:t>
+      </w:r>
+      <w:r>
+        <w:t xml:space="preserve">иначе функции класса импортируются из </w:t>
+      </w:r>
+      <w:proofErr w:type="spellStart"/>
+      <w:r>
+        <w:rPr>
+          <w:lang w:val="en-US"/>
+        </w:rPr>
+        <w:t>dll</w:t>
+      </w:r>
+      <w:proofErr w:type="spellEnd"/>
+      <w:r>
+        <w:t xml:space="preserve"> </w:t>
+      </w:r>
+      <w:r>
+        <w:t>файла.</w:t>
+      </w:r>
+      <w:r>
+        <w:t xml:space="preserve"> Для компиляции с помощью </w:t>
+      </w:r>
+      <w:r>
+        <w:rPr>
+          <w:lang w:val="en-US"/>
+        </w:rPr>
+        <w:t>g</w:t>
+      </w:r>
+      <w:r>
+        <w:t xml:space="preserve">++ </w:t>
+      </w:r>
+      <w:r>
+        <w:t xml:space="preserve">при создании </w:t>
+      </w:r>
+      <w:r>
+        <w:t>.</w:t>
+      </w:r>
+      <w:proofErr w:type="spellStart"/>
+      <w:r>
+        <w:rPr>
+          <w:lang w:val="en-US"/>
+        </w:rPr>
+        <w:t>dll</w:t>
+      </w:r>
+      <w:proofErr w:type="spellEnd"/>
+      <w:r>
+        <w:t xml:space="preserve"> </w:t>
+      </w:r>
+      <w:r>
+        <w:t xml:space="preserve">файла необходимо идентифицировать макрос </w:t>
+      </w:r>
+      <w:r>
+        <w:rPr>
+          <w:lang w:val="en-US"/>
+        </w:rPr>
+        <w:t>MYSTRING</w:t>
+      </w:r>
+      <w:r>
+        <w:t>_</w:t>
+      </w:r>
+      <w:r>
+        <w:rPr>
+          <w:lang w:val="en-US"/>
+        </w:rPr>
+        <w:t>EXPORTS</w:t>
+      </w:r>
+      <w:r>
+        <w:t xml:space="preserve"> </w:t>
+      </w:r>
+      <w:r>
+        <w:t xml:space="preserve">в флаге </w:t>
+      </w:r>
+      <w:r>
+        <w:t>-</w:t>
+      </w:r>
+      <w:r>
+        <w:rPr>
+          <w:lang w:val="en-US"/>
+        </w:rPr>
+        <w:t>D</w:t>
+      </w:r>
+      <w:r>
+        <w:t>.</w:t>
+      </w:r>
+    </w:p>
+    <w:p>
+      <w:pPr>
+        <w:rPr>
+          <w:lang w:val="en-US"/>
+        </w:rPr>
+      </w:pPr>
+    </w:p>
+    <w:p>
+      <w:pPr>
+        <w:pStyle w:val="a8"/>
+        <w:rPr>
+          <w:lang w:val="en-US"/>
+        </w:rPr>
+      </w:pPr>
+      <w:r>
+        <w:rPr>
+          <w:lang w:val="en-US"/>
+        </w:rPr>
+        <w:drawing>
+          <wp:inline distT="0" distB="0" distL="0" distR="0" wp14:anchorId="764BA3B6" wp14:editId="560C3001">
+            <wp:extent cx="6300470" cy="926465"/>
+            <wp:effectExtent l="0" t="0" r="0" b="0"/>
+            <wp:docPr id="551349534" name="Picture 1"/>
+            <wp:cNvGraphicFramePr>
+              <a:graphicFrameLocks xmlns:a="http://schemas.openxmlformats.org/drawingml/2006/main" noChangeAspect="1"/>
+            </wp:cNvGraphicFramePr>
+            <a:graphic xmlns:a="http://schemas.openxmlformats.org/drawingml/2006/main">
+              <a:graphicData uri="http://schemas.openxmlformats.org/drawingml/2006/picture">
+                <pic:pic xmlns:pic="http://schemas.openxmlformats.org/drawingml/2006/picture">
+                  <pic:nvPicPr>
+                    <pic:cNvPr id="551349534" name=""/>
+                    <pic:cNvPicPr/>
+                  </pic:nvPicPr>
+                  <pic:blipFill>
+                    <a:blip r:embed="rId16"/>
+                    <a:stretch>
+                      <a:fillRect/>
+                    </a:stretch>
+                  </pic:blipFill>
+                  <pic:spPr>
+                    <a:xfrm>
+                      <a:off x="0" y="0"/>
+                      <a:ext cx="6300470" cy="926465"/>
+                    </a:xfrm>
+                    <a:prstGeom prst="rect">
+                      <a:avLst/>
+                    </a:prstGeom>
+                  </pic:spPr>
+                </pic:pic>
+              </a:graphicData>
+            </a:graphic>
+          </wp:inline>
+        </w:drawing>
+      </w:r>
+    </w:p>
+    <w:p>
+      <w:pPr>
+        <w:pStyle w:val="a"/>
+      </w:pPr>
+      <w:r>
+        <w:t xml:space="preserve">Компиляция </w:t>
+      </w:r>
+      <w:r>
+        <w:rPr>
+          <w:lang w:val="en-US"/>
+        </w:rPr>
+        <w:t>.</w:t>
+      </w:r>
+      <w:proofErr w:type="spellStart"/>
+      <w:r>
+        <w:rPr>
+          <w:lang w:val="en-US"/>
+        </w:rPr>
+        <w:t>dll</w:t>
+      </w:r>
+      <w:proofErr w:type="spellEnd"/>
+      <w:r>
+        <w:rPr>
+          <w:lang w:val="en-US"/>
+        </w:rPr>
+        <w:t xml:space="preserve"> </w:t>
+      </w:r>
+      <w:r>
+        <w:t>файла.</w:t>
+      </w:r>
+    </w:p>
+    <w:p>
+      <w:pPr>
+        <w:rPr>
+          <w:lang w:val="en-US"/>
+        </w:rPr>
+      </w:pPr>
+    </w:p>
+    <w:p>
+      <w:r>
+        <w:rPr>
+          <w:b/>
+          <w:bCs/>
+        </w:rPr>
+        <w:t xml:space="preserve">Анализ таблицы </w:t>
+      </w:r>
+      <w:r>
+        <w:rPr>
+          <w:b/>
+          <w:bCs/>
+          <w:lang w:val="en-US"/>
+        </w:rPr>
+        <w:t>Exports</w:t>
+      </w:r>
+      <w:r>
+        <w:rPr>
+          <w:b/>
+          <w:bCs/>
+        </w:rPr>
+        <w:t xml:space="preserve">: </w:t>
+      </w:r>
+      <w:r>
+        <w:t xml:space="preserve">с помощью дизасаемблера </w:t>
+      </w:r>
+      <w:r>
+        <w:rPr>
+          <w:lang w:val="en-US"/>
+        </w:rPr>
+        <w:t>IDA</w:t>
+      </w:r>
+      <w:r>
+        <w:t xml:space="preserve"> </w:t>
+      </w:r>
+      <w:r>
+        <w:rPr>
+          <w:lang w:val="en-US"/>
+        </w:rPr>
+        <w:t>Pro</w:t>
+      </w:r>
+      <w:r>
+        <w:t xml:space="preserve">, </w:t>
+      </w:r>
+      <w:r>
+        <w:t xml:space="preserve">полученный </w:t>
+      </w:r>
+      <w:proofErr w:type="spellStart"/>
+      <w:r>
+        <w:rPr>
+          <w:lang w:val="en-US"/>
+        </w:rPr>
+        <w:t>dll</w:t>
+      </w:r>
+      <w:proofErr w:type="spellEnd"/>
+      <w:r>
+        <w:t xml:space="preserve"> </w:t>
+      </w:r>
+      <w:r>
+        <w:t>файл был открыт и из него была получена таблица экспортов, в которой находятся все созданные ранее методы класса.</w:t>
+      </w:r>
+    </w:p>
+    <w:p/>
+    <w:p>
+      <w:pPr>
+        <w:pStyle w:val="a8"/>
+      </w:pPr>
+      <w:r>
+        <w:lastRenderedPageBreak/>
+        <w:drawing>
+          <wp:inline distT="0" distB="0" distL="0" distR="0" wp14:anchorId="5260CFED" wp14:editId="622170F7">
+            <wp:extent cx="6300470" cy="6091555"/>
+            <wp:effectExtent l="0" t="0" r="0" b="0"/>
+            <wp:docPr id="233523289" name="Picture 1"/>
+            <wp:cNvGraphicFramePr>
+              <a:graphicFrameLocks xmlns:a="http://schemas.openxmlformats.org/drawingml/2006/main" noChangeAspect="1"/>
+            </wp:cNvGraphicFramePr>
+            <a:graphic xmlns:a="http://schemas.openxmlformats.org/drawingml/2006/main">
+              <a:graphicData uri="http://schemas.openxmlformats.org/drawingml/2006/picture">
+                <pic:pic xmlns:pic="http://schemas.openxmlformats.org/drawingml/2006/picture">
+                  <pic:nvPicPr>
+                    <pic:cNvPr id="233523289" name=""/>
+                    <pic:cNvPicPr/>
+                  </pic:nvPicPr>
+                  <pic:blipFill>
+                    <a:blip r:embed="rId17"/>
+                    <a:stretch>
+                      <a:fillRect/>
+                    </a:stretch>
+                  </pic:blipFill>
+                  <pic:spPr>
+                    <a:xfrm>
+                      <a:off x="0" y="0"/>
+                      <a:ext cx="6300470" cy="6091555"/>
+                    </a:xfrm>
+                    <a:prstGeom prst="rect">
+                      <a:avLst/>
+                    </a:prstGeom>
+                  </pic:spPr>
+                </pic:pic>
+              </a:graphicData>
+            </a:graphic>
+          </wp:inline>
+        </w:drawing>
+      </w:r>
+    </w:p>
+    <w:p>
+      <w:pPr>
+        <w:pStyle w:val="a"/>
+      </w:pPr>
+      <w:r>
+        <w:t xml:space="preserve">Таблица экспортов в </w:t>
+      </w:r>
+      <w:r>
+        <w:rPr>
+          <w:lang w:val="en-US"/>
+        </w:rPr>
+        <w:t>IDA</w:t>
+      </w:r>
+      <w:r>
+        <w:t xml:space="preserve"> </w:t>
+      </w:r>
+      <w:r>
+        <w:rPr>
+          <w:lang w:val="en-US"/>
+        </w:rPr>
+        <w:t>Pro</w:t>
+      </w:r>
+      <w:r>
+        <w:t>.</w:t>
+      </w:r>
+    </w:p>
+    <w:p/>
+    <w:p>
+      <w:r>
+        <w:t xml:space="preserve">Далее </w:t>
+      </w:r>
+      <w:r>
+        <w:rPr>
+          <w:lang w:val="en-US"/>
+        </w:rPr>
+        <w:t>main</w:t>
+      </w:r>
+      <w:r>
+        <w:t>.</w:t>
+      </w:r>
+      <w:proofErr w:type="spellStart"/>
+      <w:r>
+        <w:rPr>
+          <w:lang w:val="en-US"/>
+        </w:rPr>
+        <w:t>cpp</w:t>
+      </w:r>
+      <w:proofErr w:type="spellEnd"/>
+      <w:r>
+        <w:t xml:space="preserve">, </w:t>
+      </w:r>
+      <w:r>
+        <w:t xml:space="preserve">взятый из приложения 1 был скомпилирован, с включением реализованной </w:t>
+      </w:r>
+      <w:proofErr w:type="spellStart"/>
+      <w:r>
+        <w:rPr>
+          <w:lang w:val="en-US"/>
+        </w:rPr>
+        <w:t>dll</w:t>
+      </w:r>
+      <w:proofErr w:type="spellEnd"/>
+      <w:r>
+        <w:t xml:space="preserve"> </w:t>
+      </w:r>
+      <w:r>
+        <w:t>командой:</w:t>
+      </w:r>
+    </w:p>
+    <w:p>
+      <w:pPr>
+        <w:pStyle w:val="a6"/>
+        <w:rPr>
+          <w:lang w:val="ru-RU"/>
+        </w:rPr>
+      </w:pPr>
+      <w:r>
+        <w:t>g++ -std=</w:t>
+      </w:r>
+      <w:proofErr w:type="spellStart"/>
+      <w:r>
+        <w:t>c++</w:t>
+      </w:r>
+      <w:proofErr w:type="spellEnd"/>
+      <w:r>
+        <w:t>17 main.cpp -L. -</w:t>
+      </w:r>
+      <w:proofErr w:type="spellStart"/>
+      <w:r>
+        <w:t>lMyString</w:t>
+      </w:r>
+      <w:proofErr w:type="spellEnd"/>
+      <w:r>
+        <w:t xml:space="preserve"> -o main.exe</w:t>
+      </w:r>
+    </w:p>
+    <w:p>
+      <w:r>
+        <w:t xml:space="preserve">Затем полученный </w:t>
+      </w:r>
+      <w:r>
+        <w:rPr>
+          <w:lang w:val="en-US"/>
+        </w:rPr>
+        <w:t>main</w:t>
+      </w:r>
+      <w:r>
+        <w:t>.</w:t>
+      </w:r>
+      <w:r>
+        <w:rPr>
+          <w:lang w:val="en-US"/>
+        </w:rPr>
+        <w:t>exe</w:t>
+      </w:r>
+      <w:r>
+        <w:t xml:space="preserve"> </w:t>
+      </w:r>
+      <w:r>
+        <w:t xml:space="preserve">был открыт в </w:t>
+      </w:r>
+      <w:r>
+        <w:rPr>
+          <w:lang w:val="en-US"/>
+        </w:rPr>
+        <w:t>IDA</w:t>
+      </w:r>
+      <w:r>
+        <w:t xml:space="preserve">, </w:t>
+      </w:r>
+      <w:r>
+        <w:t xml:space="preserve">и во время отладки в регистре </w:t>
+      </w:r>
+      <w:proofErr w:type="spellStart"/>
+      <w:r>
+        <w:rPr>
+          <w:lang w:val="en-US"/>
+        </w:rPr>
+        <w:t>rdx</w:t>
+      </w:r>
+      <w:proofErr w:type="spellEnd"/>
+      <w:r>
+        <w:t xml:space="preserve"> </w:t>
+      </w:r>
+      <w:r>
+        <w:t>можно увидеть записываемое сообщение.</w:t>
+      </w:r>
+    </w:p>
+    <w:p/>
+    <w:p>
+      <w:pPr>
+        <w:pStyle w:val="a8"/>
+        <w:rPr>
+          <w:lang w:val="en-US"/>
+        </w:rPr>
+      </w:pPr>
+      <w:r>
+        <w:rPr>
+          <w:lang w:val="en-US"/>
+        </w:rPr>
+        <w:lastRenderedPageBreak/>
+        <w:drawing>
+          <wp:inline distT="0" distB="0" distL="0" distR="0" wp14:anchorId="7A7D8991" wp14:editId="71C2BD85">
+            <wp:extent cx="6300470" cy="2854960"/>
+            <wp:effectExtent l="0" t="0" r="0" b="0"/>
+            <wp:docPr id="1712687488" name="Picture 1"/>
+            <wp:cNvGraphicFramePr>
+              <a:graphicFrameLocks xmlns:a="http://schemas.openxmlformats.org/drawingml/2006/main" noChangeAspect="1"/>
+            </wp:cNvGraphicFramePr>
+            <a:graphic xmlns:a="http://schemas.openxmlformats.org/drawingml/2006/main">
+              <a:graphicData uri="http://schemas.openxmlformats.org/drawingml/2006/picture">
+                <pic:pic xmlns:pic="http://schemas.openxmlformats.org/drawingml/2006/picture">
+                  <pic:nvPicPr>
+                    <pic:cNvPr id="1712687488" name=""/>
+                    <pic:cNvPicPr/>
+                  </pic:nvPicPr>
+                  <pic:blipFill>
+                    <a:blip r:embed="rId18"/>
+                    <a:stretch>
+                      <a:fillRect/>
+                    </a:stretch>
+                  </pic:blipFill>
+                  <pic:spPr>
+                    <a:xfrm>
+                      <a:off x="0" y="0"/>
+                      <a:ext cx="6300470" cy="2854960"/>
+                    </a:xfrm>
+                    <a:prstGeom prst="rect">
+                      <a:avLst/>
+                    </a:prstGeom>
+                  </pic:spPr>
+                </pic:pic>
+              </a:graphicData>
+            </a:graphic>
+          </wp:inline>
+        </w:drawing>
+      </w:r>
+    </w:p>
+    <w:p>
+      <w:pPr>
+        <w:pStyle w:val="a"/>
+      </w:pPr>
+      <w:r>
+        <w:t xml:space="preserve">Отладка </w:t>
+      </w:r>
+      <w:r>
+        <w:rPr>
+          <w:lang w:val="en-US"/>
+        </w:rPr>
+        <w:t>main.exe</w:t>
+      </w:r>
+      <w:r>
+        <w:t>.</w:t>
+      </w:r>
+    </w:p>
+    <w:p/>
+    <w:p>
+      <w:r>
+        <w:t xml:space="preserve">Затем было вычислено расположение выводимой строки, которое находилось в регистре </w:t>
+      </w:r>
+      <w:proofErr w:type="spellStart"/>
+      <w:r>
+        <w:rPr>
+          <w:lang w:val="en-US"/>
+        </w:rPr>
+        <w:t>rdx</w:t>
+      </w:r>
+      <w:proofErr w:type="spellEnd"/>
+      <w:r>
+        <w:t xml:space="preserve">. </w:t>
+      </w:r>
+      <w:r>
+        <w:t xml:space="preserve">По данному адресу в </w:t>
+      </w:r>
+      <w:r>
+        <w:rPr>
+          <w:lang w:val="en-US"/>
+        </w:rPr>
+        <w:t>Hex</w:t>
+      </w:r>
+      <w:r>
+        <w:t>-</w:t>
+      </w:r>
+      <w:r>
+        <w:rPr>
+          <w:lang w:val="en-US"/>
+        </w:rPr>
+        <w:t>View</w:t>
+      </w:r>
+      <w:r>
+        <w:t>-1 можно найти выводимую строку.</w:t>
+      </w:r>
+    </w:p>
+    <w:p/>
+    <w:p>
+      <w:pPr>
+        <w:pStyle w:val="a8"/>
+      </w:pPr>
+      <w:r>
+        <w:drawing>
+          <wp:inline distT="0" distB="0" distL="0" distR="0" wp14:anchorId="70FF2436" wp14:editId="654E2F78">
+            <wp:extent cx="6300470" cy="2722245"/>
+            <wp:effectExtent l="0" t="0" r="0" b="0"/>
+            <wp:docPr id="445476488" name="Picture 1"/>
+            <wp:cNvGraphicFramePr>
+              <a:graphicFrameLocks xmlns:a="http://schemas.openxmlformats.org/drawingml/2006/main" noChangeAspect="1"/>
+            </wp:cNvGraphicFramePr>
+            <a:graphic xmlns:a="http://schemas.openxmlformats.org/drawingml/2006/main">
+              <a:graphicData uri="http://schemas.openxmlformats.org/drawingml/2006/picture">
+                <pic:pic xmlns:pic="http://schemas.openxmlformats.org/drawingml/2006/picture">
+                  <pic:nvPicPr>
+                    <pic:cNvPr id="445476488" name=""/>
+                    <pic:cNvPicPr/>
+                  </pic:nvPicPr>
+                  <pic:blipFill>
+                    <a:blip r:embed="rId19"/>
+                    <a:stretch>
+                      <a:fillRect/>
+                    </a:stretch>
+                  </pic:blipFill>
+                  <pic:spPr>
+                    <a:xfrm>
+                      <a:off x="0" y="0"/>
+                      <a:ext cx="6300470" cy="2722245"/>
+                    </a:xfrm>
+                    <a:prstGeom prst="rect">
+                      <a:avLst/>
+                    </a:prstGeom>
+                  </pic:spPr>
+                </pic:pic>
+              </a:graphicData>
+            </a:graphic>
+          </wp:inline>
+        </w:drawing>
+      </w:r>
+    </w:p>
+    <w:p>
+      <w:pPr>
+        <w:pStyle w:val="a"/>
+      </w:pPr>
+      <w:r>
+        <w:t>Выводимая строка в памяти.</w:t>
+      </w:r>
+    </w:p>
+    <w:p>
+      <w:pPr>
+        <w:rPr>
+          <w:lang w:val="en-US"/>
+        </w:rPr>
+      </w:pPr>
+    </w:p>
+    <w:p>
+      <w:r>
+        <w:t>Затем строка была отредактированна напрямую в куче.</w:t>
+      </w:r>
+    </w:p>
+    <w:p/>
+    <w:p>
+      <w:pPr>
+        <w:pStyle w:val="a8"/>
+      </w:pPr>
+      <w:r>
+        <w:lastRenderedPageBreak/>
+        <w:drawing>
+          <wp:inline distT="0" distB="0" distL="0" distR="0" wp14:anchorId="0DC9D002" wp14:editId="2F3CC842">
+            <wp:extent cx="6300470" cy="2063750"/>
+            <wp:effectExtent l="0" t="0" r="0" b="0"/>
+            <wp:docPr id="1938423612" name="Picture 1"/>
+            <wp:cNvGraphicFramePr>
+              <a:graphicFrameLocks xmlns:a="http://schemas.openxmlformats.org/drawingml/2006/main" noChangeAspect="1"/>
+            </wp:cNvGraphicFramePr>
+            <a:graphic xmlns:a="http://schemas.openxmlformats.org/drawingml/2006/main">
+              <a:graphicData uri="http://schemas.openxmlformats.org/drawingml/2006/picture">
+                <pic:pic xmlns:pic="http://schemas.openxmlformats.org/drawingml/2006/picture">
+                  <pic:nvPicPr>
+                    <pic:cNvPr id="1938423612" name=""/>
+                    <pic:cNvPicPr/>
+                  </pic:nvPicPr>
+                  <pic:blipFill>
+                    <a:blip r:embed="rId20"/>
+                    <a:stretch>
+                      <a:fillRect/>
+                    </a:stretch>
+                  </pic:blipFill>
+                  <pic:spPr>
+                    <a:xfrm>
+                      <a:off x="0" y="0"/>
+                      <a:ext cx="6300470" cy="2063750"/>
+                    </a:xfrm>
+                    <a:prstGeom prst="rect">
+                      <a:avLst/>
+                    </a:prstGeom>
+                  </pic:spPr>
+                </pic:pic>
+              </a:graphicData>
+            </a:graphic>
+          </wp:inline>
+        </w:drawing>
+      </w:r>
+    </w:p>
+    <w:p>
+      <w:pPr>
+        <w:pStyle w:val="a"/>
+      </w:pPr>
+      <w:r>
+        <w:t>Редактирование строки в памяти.</w:t>
+      </w:r>
+    </w:p>
+    <w:p/>
+    <w:p>
+      <w:pPr>
+        <w:pStyle w:val="a8"/>
+        <w:rPr>
+          <w:lang w:val="en-US"/>
+        </w:rPr>
+      </w:pPr>
+      <w:r>
+        <w:rPr>
+          <w:lang w:val="en-US"/>
+        </w:rPr>
+        <w:drawing>
+          <wp:inline distT="0" distB="0" distL="0" distR="0" wp14:anchorId="4ECF583B" wp14:editId="6F978473">
+            <wp:extent cx="6300470" cy="3318510"/>
+            <wp:effectExtent l="0" t="0" r="0" b="0"/>
+            <wp:docPr id="485734185" name="Picture 1"/>
+            <wp:cNvGraphicFramePr>
+              <a:graphicFrameLocks xmlns:a="http://schemas.openxmlformats.org/drawingml/2006/main" noChangeAspect="1"/>
+            </wp:cNvGraphicFramePr>
+            <a:graphic xmlns:a="http://schemas.openxmlformats.org/drawingml/2006/main">
+              <a:graphicData uri="http://schemas.openxmlformats.org/drawingml/2006/picture">
+                <pic:pic xmlns:pic="http://schemas.openxmlformats.org/drawingml/2006/picture">
+                  <pic:nvPicPr>
+                    <pic:cNvPr id="485734185" name=""/>
+                    <pic:cNvPicPr/>
+                  </pic:nvPicPr>
+                  <pic:blipFill>
+                    <a:blip r:embed="rId21"/>
+                    <a:stretch>
+                      <a:fillRect/>
+                    </a:stretch>
+                  </pic:blipFill>
+                  <pic:spPr>
+                    <a:xfrm>
+                      <a:off x="0" y="0"/>
+                      <a:ext cx="6300470" cy="3318510"/>
+                    </a:xfrm>
+                    <a:prstGeom prst="rect">
+                      <a:avLst/>
+                    </a:prstGeom>
+                  </pic:spPr>
+                </pic:pic>
+              </a:graphicData>
+            </a:graphic>
+          </wp:inline>
+        </w:drawing>
+      </w:r>
+    </w:p>
+    <w:p>
+      <w:pPr>
+        <w:pStyle w:val="a"/>
+      </w:pPr>
+      <w:r>
+        <w:t>Отредлактированная строка в выводе.</w:t>
+      </w:r>
+    </w:p>
+    <w:p>
+      <w:pPr>
+        <w:spacing w:line="240" w:lineRule="auto"/>
+        <w:ind w:firstLine="0"/>
+      </w:pPr>
+      <w:r>
+        <w:br w:type="page"/>
+      </w:r>
+    </w:p>
+    <w:p/>
+    <w:p/>
+    <w:p/>
+    <w:p>
+      <w:pPr>
         <w:pStyle w:val="a9"/>
       </w:pPr>
       <w:r>
@@ -5489,7 +6329,7 @@
                     <pic:cNvPicPr/>
                   </pic:nvPicPr>
                   <pic:blipFill>
-                    <a:blip r:embed="rId16"/>
+                    <a:blip r:embed="rId22"/>
                     <a:stretch>
                       <a:fillRect/>
                     </a:stretch>
@@ -5521,7 +6361,6 @@
     <w:p/>
     <w:p>
       <w:r>
-        <w:lastRenderedPageBreak/>
         <w:t xml:space="preserve">В результате тестирования, класс и </w:t>
       </w:r>
       <w:r>
@@ -50208,15 +51047,7 @@
       </w:r>
       <w:proofErr w:type="spellEnd"/>
       <w:r>
-        <w:t xml:space="preserve"> </w:t>
-      </w:r>
-      <w:proofErr w:type="spellStart"/>
-      <w:r>
-        <w:t>val</w:t>
-      </w:r>
-      <w:proofErr w:type="spellEnd"/>
-      <w:r>
-        <w:t>;</w:t>
+        <w:t xml:space="preserve"> val;</w:t>
       </w:r>
     </w:p>
     <w:p>
@@ -55772,12 +56603,12 @@
       </w:pPr>
     </w:p>
     <w:sectPr>
-      <w:headerReference w:type="even" r:id="rId17"/>
-      <w:headerReference w:type="default" r:id="rId18"/>
-      <w:footerReference w:type="even" r:id="rId19"/>
-      <w:footerReference w:type="default" r:id="rId20"/>
-      <w:headerReference w:type="first" r:id="rId21"/>
-      <w:footerReference w:type="first" r:id="rId22"/>
+      <w:headerReference w:type="even" r:id="rId23"/>
+      <w:headerReference w:type="default" r:id="rId24"/>
+      <w:footerReference w:type="even" r:id="rId25"/>
+      <w:footerReference w:type="default" r:id="rId26"/>
+      <w:headerReference w:type="first" r:id="rId27"/>
+      <w:footerReference w:type="first" r:id="rId28"/>
       <w:pgSz w:w="11906" w:h="16838"/>
       <w:pgMar w:top="1134" w:right="850" w:bottom="1134" w:left="1134" w:header="708" w:footer="708" w:gutter="0"/>
       <w:cols w:space="708"/>
@@ -59309,7 +60140,6 @@
   <w:style w:type="character" w:default="1" w:styleId="DefaultParagraphFont">
     <w:name w:val="Default Paragraph Font"/>
     <w:uiPriority w:val="1"/>
-    <w:semiHidden/>
     <w:unhideWhenUsed/>
   </w:style>
   <w:style w:type="table" w:default="1" w:styleId="TableNormal">

</xml_diff>